<commit_message>
remove em dashes from Word document, replace with hyphens
</commit_message>
<xml_diff>
--- a/docs/IOLA_Open_Problem_Statement.docx
+++ b/docs/IOLA_Open_Problem_Statement.docx
@@ -234,7 +234,7 @@
           <w:sz w:val="26"/>
           <w:szCs w:val="26"/>
         </w:rPr>
-        <w:t xml:space="preserve">Given a catalog of 15,000+ actively tracked orbital objects, compute all pairwise conjunction risks — including cascade-weighted orbital shell density — in under 100 milliseconds on commodity CPU hardware.</w:t>
+        <w:t xml:space="preserve">Given a catalog of 15,000+ actively tracked orbital objects, compute all pairwise conjunction risks - including cascade-weighted orbital shell density - in under 100 milliseconds on commodity CPU hardware.</w:t>
       </w:r>
     </w:p>
     <w:p>
@@ -286,7 +286,7 @@
           <w:sz w:val="22"/>
           <w:szCs w:val="22"/>
         </w:rPr>
-        <w:t xml:space="preserve">In 1978 Donald Kessler and Burton Cour-Palais described a cascade failure scenario that has since become the defining existential risk of orbital infrastructure: a collision in LEO generates debris, each fragment strikes other satellites, more debris, more collisions — until the orbital shell becomes self-sustaining in its own destruction.</w:t>
+        <w:t xml:space="preserve">In 1978 Donald Kessler and Burton Cour-Palais described a cascade failure scenario that has since become the defining existential risk of orbital infrastructure: a collision in LEO generates debris, each fragment strikes other satellites, more debris, more collisions - until the orbital shell becomes self-sustaining in its own destruction.</w:t>
       </w:r>
     </w:p>
     <w:p>
@@ -369,7 +369,7 @@
           <w:sz w:val="22"/>
           <w:szCs w:val="22"/>
         </w:rPr>
-        <w:t xml:space="preserve">The pair count is not fixed — it grows with the catalog, which grows continuously:</w:t>
+        <w:t xml:space="preserve">The pair count is not fixed - it grows with the catalog, which grows continuously:</w:t>
       </w:r>
     </w:p>
     <w:p>
@@ -928,7 +928,7 @@
           <w:sz w:val="22"/>
           <w:szCs w:val="22"/>
         </w:rPr>
-        <w:t xml:space="preserve">At 1 millisecond per surviving pair on CPU: 5.9 million pairs = 5,900 seconds = 98 minutes. The goal is 100ms total — requiring a 35,000x improvement over naive serial execution.</w:t>
+        <w:t xml:space="preserve">At 1 millisecond per surviving pair on CPU: 5.9 million pairs = 5,900 seconds = 98 minutes. The goal is 100ms total - requiring a 35,000x improvement over naive serial execution.</w:t>
       </w:r>
     </w:p>
     <w:p>
@@ -1334,7 +1334,7 @@
                 <w:sz w:val="20"/>
                 <w:szCs w:val="20"/>
               </w:rPr>
-              <w:t xml:space="preserve">Propagation only — not full pipeline</w:t>
+              <w:t xml:space="preserve">Propagation only - not full pipeline</w:t>
             </w:r>
           </w:p>
         </w:tc>
@@ -1451,7 +1451,7 @@
           <w:sz w:val="22"/>
           <w:szCs w:val="22"/>
         </w:rPr>
-        <w:t xml:space="preserve">jaxsgp4 (arxiv:2603.27830) solves propagation. Nobody has published the full pipeline — propagation + pairwise geometry + TCA + cascade-weighted risk scoring — at sub-second scale on CPU.</w:t>
+        <w:t xml:space="preserve">jaxsgp4 (arxiv:2603.27830) solves propagation. Nobody has published the full pipeline - propagation + pairwise geometry + TCA + cascade-weighted risk scoring - at sub-second scale on CPU.</w:t>
       </w:r>
     </w:p>
     <w:p>
@@ -1648,7 +1648,7 @@
           <w:sz w:val="22"/>
           <w:szCs w:val="22"/>
         </w:rPr>
-        <w:t xml:space="preserve">Time of Closest Approach (TCA) — UTC timestamp accurate to ±2 seconds</w:t>
+        <w:t xml:space="preserve">Time of Closest Approach (TCA) - UTC timestamp accurate to ±2 seconds</w:t>
       </w:r>
     </w:p>
     <w:p>
@@ -1667,7 +1667,7 @@
           <w:sz w:val="22"/>
           <w:szCs w:val="22"/>
         </w:rPr>
-        <w:t xml:space="preserve">Miss distance at TCA — in km, accurate to ±1 km for LEO objects</w:t>
+        <w:t xml:space="preserve">Miss distance at TCA - in km, accurate to ±1 km for LEO objects</w:t>
       </w:r>
     </w:p>
     <w:p>
@@ -1705,7 +1705,7 @@
           <w:sz w:val="22"/>
           <w:szCs w:val="22"/>
         </w:rPr>
-        <w:t xml:space="preserve">Conjunction Data Message (CDM) — structured advisory, CCSDS 508.0-B-1 mappable</w:t>
+        <w:t xml:space="preserve">Conjunction Data Message (CDM) - structured advisory, CCSDS 508.0-B-1 mappable</w:t>
       </w:r>
     </w:p>
     <w:p>
@@ -2133,7 +2133,7 @@
                 <w:sz w:val="20"/>
                 <w:szCs w:val="20"/>
               </w:rPr>
-              <w:t xml:space="preserve">Commodity CPU — any modern server or laptop</w:t>
+              <w:t xml:space="preserve">Commodity CPU - any modern server or laptop</w:t>
             </w:r>
           </w:p>
         </w:tc>
@@ -2221,7 +2221,7 @@
           <w:sz w:val="22"/>
           <w:szCs w:val="22"/>
         </w:rPr>
-        <w:t xml:space="preserve">Each satellite must be propagated to multiple future time points using SGP4/SDP4. jaxsgp4 (Cambridge, 2026) solves this on GPU. The CPU equivalent — without hardware parallelism — requires vectorised batch evaluation using sgp4_array() and numpy, and has not been done at sub-second scale for 15k+ objects.</w:t>
+        <w:t xml:space="preserve">Each satellite must be propagated to multiple future time points using SGP4/SDP4. jaxsgp4 (Cambridge, 2026) solves this on GPU. The CPU equivalent - without hardware parallelism - requires vectorised batch evaluation using sgp4_array() and numpy, and has not been done at sub-second scale for 15k+ objects.</w:t>
       </w:r>
     </w:p>
     <w:p>
@@ -2295,7 +2295,7 @@
           <w:sz w:val="22"/>
           <w:szCs w:val="22"/>
         </w:rPr>
-        <w:t xml:space="preserve">The composite risk score includes an orbital shell density factor — a function of how many objects share the altitude band of the conjunction. Computing this naively requires querying the full catalog for each pair. A histogram pre-computation reduces it to O(n) setup + O(1) lookup per pair. This must be integrated into the same vectorised pass.</w:t>
+        <w:t xml:space="preserve">The composite risk score includes an orbital shell density factor - a function of how many objects share the altitude band of the conjunction. Computing this naively requires querying the full catalog for each pair. A histogram pre-computation reduces it to O(n) setup + O(1) lookup per pair. This must be integrated into the same vectorised pass.</w:t>
       </w:r>
     </w:p>
     <w:p>
@@ -3191,7 +3191,7 @@
           <w:sz w:val="22"/>
           <w:szCs w:val="22"/>
         </w:rPr>
-        <w:t xml:space="preserve">ISS ZARYA vs ISS UNITY: 0.000 km miss distance, CRITICAL — co-orbiting modules correctly identified</w:t>
+        <w:t xml:space="preserve">ISS ZARYA vs ISS UNITY: 0.000 km miss distance, CRITICAL - co-orbiting modules correctly identified</w:t>
       </w:r>
     </w:p>
     <w:p>
@@ -3290,7 +3290,7 @@
           <w:sz w:val="22"/>
           <w:szCs w:val="22"/>
         </w:rPr>
-        <w:t xml:space="preserve">compute_tle_age_uncertainty_km() — bstar-weighted quadratic uncertainty: σ(t) = σ₀ + k × (|B*| / B*_nominal) × age²</w:t>
+        <w:t xml:space="preserve">compute_tle_age_uncertainty_km() - bstar-weighted quadratic uncertainty: σ(t) = σ₀ + k × (|B*| / B*_nominal) × age²</w:t>
       </w:r>
     </w:p>
     <w:p>
@@ -3309,7 +3309,7 @@
           <w:sz w:val="22"/>
           <w:szCs w:val="22"/>
         </w:rPr>
-        <w:t xml:space="preserve">compute_orbital_shell_density() — Kessler cascade factor from live catalog population</w:t>
+        <w:t xml:space="preserve">compute_orbital_shell_density() - Kessler cascade factor from live catalog population</w:t>
       </w:r>
     </w:p>
     <w:p>
@@ -3328,7 +3328,7 @@
           <w:sz w:val="22"/>
           <w:szCs w:val="22"/>
         </w:rPr>
-        <w:t xml:space="preserve">compute_composite_risk_score() — 6-component weighted risk formula including both novel terms</w:t>
+        <w:t xml:space="preserve">compute_composite_risk_score() - 6-component weighted risk formula including both novel terms</w:t>
       </w:r>
     </w:p>
     <w:p>
@@ -3414,7 +3414,7 @@
           <w:sz w:val="22"/>
           <w:szCs w:val="22"/>
         </w:rPr>
-        <w:t xml:space="preserve">A CPU-native conjunction screening pipeline that processes the full LEO catalog in under 100ms — the first publicly verifiable implementation at this scale</w:t>
+        <w:t xml:space="preserve">A CPU-native conjunction screening pipeline that processes the full LEO catalog in under 100ms - the first publicly verifiable implementation at this scale</w:t>
       </w:r>
     </w:p>
     <w:p>
@@ -3433,7 +3433,7 @@
           <w:sz w:val="22"/>
           <w:szCs w:val="22"/>
         </w:rPr>
-        <w:t xml:space="preserve">Real-time Kessler cascade risk scoring — not just pairwise Pc (USSPACECOM standard) but cascade-weighted orbital shell risk reflecting true consequence</w:t>
+        <w:t xml:space="preserve">Real-time Kessler cascade risk scoring - not just pairwise Pc (USSPACECOM standard) but cascade-weighted orbital shell risk reflecting true consequence</w:t>
       </w:r>
     </w:p>
     <w:p>
@@ -3452,7 +3452,7 @@
           <w:sz w:val="22"/>
           <w:szCs w:val="22"/>
         </w:rPr>
-        <w:t xml:space="preserve">A foundation for autonomous orbital coordination — millisecond screening enables onboard real-time conjunction awareness, the prerequisite for IkirereMesh Phase 3</w:t>
+        <w:t xml:space="preserve">A foundation for autonomous orbital coordination - millisecond screening enables onboard real-time conjunction awareness, the prerequisite for IkirereMesh Phase 3</w:t>
       </w:r>
     </w:p>
     <w:p>
@@ -3548,7 +3548,7 @@
           <w:sz w:val="22"/>
           <w:szCs w:val="22"/>
         </w:rPr>
-        <w:t xml:space="preserve">Research collaborators — CPU systems researchers, astrodynamicists, ML engineers at the intersection of orbital mechanics and real-time systems</w:t>
+        <w:t xml:space="preserve">Research collaborators - CPU systems researchers, astrodynamicists, ML engineers at the intersection of orbital mechanics and real-time systems</w:t>
       </w:r>
     </w:p>
     <w:p>
@@ -3567,7 +3567,7 @@
           <w:sz w:val="22"/>
           <w:szCs w:val="22"/>
         </w:rPr>
-        <w:t xml:space="preserve">Compute contributors — access to high-core-count CPU time for benchmarking and validation</w:t>
+        <w:t xml:space="preserve">Compute contributors - access to high-core-count CPU time for benchmarking and validation</w:t>
       </w:r>
     </w:p>
     <w:p>
@@ -3586,7 +3586,7 @@
           <w:sz w:val="22"/>
           <w:szCs w:val="22"/>
         </w:rPr>
-        <w:t xml:space="preserve">Co-authors — for the research paper targeting ICML/NeurIPS/IEEE Aerospace</w:t>
+        <w:t xml:space="preserve">Co-authors - for the research paper targeting ICML/NeurIPS/IEEE Aerospace</w:t>
       </w:r>
     </w:p>
     <w:p>
@@ -3754,7 +3754,7 @@
                 <w:sz w:val="20"/>
                 <w:szCs w:val="20"/>
               </w:rPr>
-              <w:t xml:space="preserve">Jason Quist — Founder &amp; CEO, Ikirere Orbital Labs Africa</w:t>
+              <w:t xml:space="preserve">Jason Quist - Founder &amp; CEO, Ikirere Orbital Labs Africa</w:t>
             </w:r>
           </w:p>
         </w:tc>

</xml_diff>